<commit_message>
Now with a better P01
</commit_message>
<xml_diff>
--- a/guide_builder/P02_Flashing_Lights_Guide.docx
+++ b/guide_builder/P02_Flashing_Lights_Guide.docx
@@ -42,12 +42,12 @@
       </w:r>
       <w:r>
         <w:rPr>
-          <w:rFonts w:ascii="Consolas" w:cs="Consolas" w:eastAsia="Consolas" w:hAnsi="Consolas"/>
+          <w:rFonts w:ascii="Roboto Mono" w:cs="Roboto Mono" w:eastAsia="Roboto Mono" w:hAnsi="Roboto Mono"/>
           <w:i/>
           <w:iCs/>
           <w:color w:val="595959"/>
-          <w:sz w:val="20"/>
-          <w:szCs w:val="20"/>
+          <w:sz w:val="19"/>
+          <w:szCs w:val="19"/>
         </w:rPr>
         <w:t xml:space="preserve">p02_flashing_lights.py</w:t>
       </w:r>
@@ -63,12 +63,12 @@
       </w:r>
       <w:r>
         <w:rPr>
-          <w:rFonts w:ascii="Consolas" w:cs="Consolas" w:eastAsia="Consolas" w:hAnsi="Consolas"/>
+          <w:rFonts w:ascii="Roboto Mono" w:cs="Roboto Mono" w:eastAsia="Roboto Mono" w:hAnsi="Roboto Mono"/>
           <w:i/>
           <w:iCs/>
           <w:color w:val="595959"/>
-          <w:sz w:val="20"/>
-          <w:szCs w:val="20"/>
+          <w:sz w:val="19"/>
+          <w:szCs w:val="19"/>
         </w:rPr>
         <w:t xml:space="preserve">/workspace/p02.py</w:t>
       </w:r>
@@ -84,12 +84,12 @@
       </w:r>
       <w:r>
         <w:rPr>
-          <w:rFonts w:ascii="Consolas" w:cs="Consolas" w:eastAsia="Consolas" w:hAnsi="Consolas"/>
+          <w:rFonts w:ascii="Roboto Mono" w:cs="Roboto Mono" w:eastAsia="Roboto Mono" w:hAnsi="Roboto Mono"/>
           <w:i/>
           <w:iCs/>
           <w:color w:val="595959"/>
-          <w:sz w:val="20"/>
-          <w:szCs w:val="20"/>
+          <w:sz w:val="19"/>
+          <w:szCs w:val="19"/>
         </w:rPr>
         <w:t xml:space="preserve">/workspace</w:t>
       </w:r>
@@ -161,9 +161,9 @@
       </w:r>
       <w:r>
         <w:rPr>
-          <w:rFonts w:ascii="Consolas" w:cs="Consolas" w:eastAsia="Consolas" w:hAnsi="Consolas"/>
-          <w:sz w:val="20"/>
-          <w:szCs w:val="20"/>
+          <w:rFonts w:ascii="Roboto Mono" w:cs="Roboto Mono" w:eastAsia="Roboto Mono" w:hAnsi="Roboto Mono"/>
+          <w:sz w:val="19"/>
+          <w:szCs w:val="19"/>
         </w:rPr>
         <w:t xml:space="preserve">set_color(r, g, b)</w:t>
       </w:r>
@@ -250,7 +250,7 @@
             </w:pPr>
             <w:r>
               <w:rPr>
-                <w:rFonts w:ascii="Consolas" w:cs="Consolas" w:eastAsia="Consolas" w:hAnsi="Consolas"/>
+                <w:rFonts w:ascii="Roboto Mono" w:cs="Roboto Mono" w:eastAsia="Roboto Mono" w:hAnsi="Roboto Mono"/>
                 <w:sz w:val="19"/>
                 <w:szCs w:val="19"/>
               </w:rPr>
@@ -263,7 +263,7 @@
             </w:pPr>
             <w:r>
               <w:rPr>
-                <w:rFonts w:ascii="Consolas" w:cs="Consolas" w:eastAsia="Consolas" w:hAnsi="Consolas"/>
+                <w:rFonts w:ascii="Roboto Mono" w:cs="Roboto Mono" w:eastAsia="Roboto Mono" w:hAnsi="Roboto Mono"/>
                 <w:sz w:val="19"/>
                 <w:szCs w:val="19"/>
               </w:rPr>
@@ -276,7 +276,7 @@
             </w:pPr>
             <w:r>
               <w:rPr>
-                <w:rFonts w:ascii="Consolas" w:cs="Consolas" w:eastAsia="Consolas" w:hAnsi="Consolas"/>
+                <w:rFonts w:ascii="Roboto Mono" w:cs="Roboto Mono" w:eastAsia="Roboto Mono" w:hAnsi="Roboto Mono"/>
                 <w:sz w:val="19"/>
                 <w:szCs w:val="19"/>
               </w:rPr>
@@ -288,8 +288,15 @@
     </w:tbl>
     <w:p>
       <w:pPr>
-        <w:spacing w:after="140"/>
-      </w:pPr>
+        <w:spacing w:after="60" w:line="120"/>
+      </w:pPr>
+      <w:r>
+        <w:rPr>
+          <w:sz w:val="8"/>
+          <w:szCs w:val="8"/>
+        </w:rPr>
+        <w:t xml:space="preserve"/>
+      </w:r>
     </w:p>
     <w:p>
       <w:pPr>
@@ -304,9 +311,9 @@
       </w:r>
       <w:r>
         <w:rPr>
-          <w:rFonts w:ascii="Consolas" w:cs="Consolas" w:eastAsia="Consolas" w:hAnsi="Consolas"/>
-          <w:sz w:val="20"/>
-          <w:szCs w:val="20"/>
+          <w:rFonts w:ascii="Roboto Mono" w:cs="Roboto Mono" w:eastAsia="Roboto Mono" w:hAnsi="Roboto Mono"/>
+          <w:sz w:val="19"/>
+          <w:szCs w:val="19"/>
         </w:rPr>
         <w:t xml:space="preserve">set_color(1, 0, 0)</w:t>
       </w:r>
@@ -319,9 +326,9 @@
       </w:r>
       <w:r>
         <w:rPr>
-          <w:rFonts w:ascii="Consolas" w:cs="Consolas" w:eastAsia="Consolas" w:hAnsi="Consolas"/>
-          <w:sz w:val="20"/>
-          <w:szCs w:val="20"/>
+          <w:rFonts w:ascii="Roboto Mono" w:cs="Roboto Mono" w:eastAsia="Roboto Mono" w:hAnsi="Roboto Mono"/>
+          <w:sz w:val="19"/>
+          <w:szCs w:val="19"/>
         </w:rPr>
         <w:t xml:space="preserve">set_color(0, 0, 1)</w:t>
       </w:r>
@@ -346,9 +353,9 @@
       </w:r>
       <w:r>
         <w:rPr>
-          <w:rFonts w:ascii="Consolas" w:cs="Consolas" w:eastAsia="Consolas" w:hAnsi="Consolas"/>
-          <w:sz w:val="20"/>
-          <w:szCs w:val="20"/>
+          <w:rFonts w:ascii="Roboto Mono" w:cs="Roboto Mono" w:eastAsia="Roboto Mono" w:hAnsi="Roboto Mono"/>
+          <w:sz w:val="19"/>
+          <w:szCs w:val="19"/>
         </w:rPr>
         <w:t xml:space="preserve">alvik.begin()</w:t>
       </w:r>
@@ -435,7 +442,7 @@
             </w:pPr>
             <w:r>
               <w:rPr>
-                <w:rFonts w:ascii="Consolas" w:cs="Consolas" w:eastAsia="Consolas" w:hAnsi="Consolas"/>
+                <w:rFonts w:ascii="Roboto Mono" w:cs="Roboto Mono" w:eastAsia="Roboto Mono" w:hAnsi="Roboto Mono"/>
                 <w:sz w:val="19"/>
                 <w:szCs w:val="19"/>
               </w:rPr>
@@ -448,7 +455,7 @@
             </w:pPr>
             <w:r>
               <w:rPr>
-                <w:rFonts w:ascii="Consolas" w:cs="Consolas" w:eastAsia="Consolas" w:hAnsi="Consolas"/>
+                <w:rFonts w:ascii="Roboto Mono" w:cs="Roboto Mono" w:eastAsia="Roboto Mono" w:hAnsi="Roboto Mono"/>
                 <w:sz w:val="19"/>
                 <w:szCs w:val="19"/>
               </w:rPr>
@@ -460,8 +467,15 @@
     </w:tbl>
     <w:p>
       <w:pPr>
-        <w:spacing w:after="140"/>
-      </w:pPr>
+        <w:spacing w:after="60" w:line="120"/>
+      </w:pPr>
+      <w:r>
+        <w:rPr>
+          <w:sz w:val="8"/>
+          <w:szCs w:val="8"/>
+        </w:rPr>
+        <w:t xml:space="preserve"/>
+      </w:r>
     </w:p>
     <w:p>
       <w:pPr>
@@ -516,7 +530,7 @@
             </w:pPr>
             <w:r>
               <w:rPr>
-                <w:rFonts w:ascii="Consolas" w:cs="Consolas" w:eastAsia="Consolas" w:hAnsi="Consolas"/>
+                <w:rFonts w:ascii="Roboto Mono" w:cs="Roboto Mono" w:eastAsia="Roboto Mono" w:hAnsi="Roboto Mono"/>
                 <w:sz w:val="19"/>
                 <w:szCs w:val="19"/>
               </w:rPr>
@@ -529,7 +543,7 @@
             </w:pPr>
             <w:r>
               <w:rPr>
-                <w:rFonts w:ascii="Consolas" w:cs="Consolas" w:eastAsia="Consolas" w:hAnsi="Consolas"/>
+                <w:rFonts w:ascii="Roboto Mono" w:cs="Roboto Mono" w:eastAsia="Roboto Mono" w:hAnsi="Roboto Mono"/>
                 <w:sz w:val="19"/>
                 <w:szCs w:val="19"/>
               </w:rPr>
@@ -542,7 +556,7 @@
             </w:pPr>
             <w:r>
               <w:rPr>
-                <w:rFonts w:ascii="Consolas" w:cs="Consolas" w:eastAsia="Consolas" w:hAnsi="Consolas"/>
+                <w:rFonts w:ascii="Roboto Mono" w:cs="Roboto Mono" w:eastAsia="Roboto Mono" w:hAnsi="Roboto Mono"/>
                 <w:sz w:val="19"/>
                 <w:szCs w:val="19"/>
               </w:rPr>
@@ -554,18 +568,25 @@
     </w:tbl>
     <w:p>
       <w:pPr>
-        <w:spacing w:after="140"/>
-      </w:pPr>
-    </w:p>
-    <w:p>
-      <w:pPr>
-        <w:spacing w:after="120" w:line="276"/>
-      </w:pPr>
-      <w:r>
-        <w:rPr>
-          <w:rFonts w:ascii="Consolas" w:cs="Consolas" w:eastAsia="Consolas" w:hAnsi="Consolas"/>
-          <w:sz w:val="20"/>
-          <w:szCs w:val="20"/>
+        <w:spacing w:after="60" w:line="120"/>
+      </w:pPr>
+      <w:r>
+        <w:rPr>
+          <w:sz w:val="8"/>
+          <w:szCs w:val="8"/>
+        </w:rPr>
+        <w:t xml:space="preserve"/>
+      </w:r>
+    </w:p>
+    <w:p>
+      <w:pPr>
+        <w:spacing w:after="120" w:line="276"/>
+      </w:pPr>
+      <w:r>
+        <w:rPr>
+          <w:rFonts w:ascii="Roboto Mono" w:cs="Roboto Mono" w:eastAsia="Roboto Mono" w:hAnsi="Roboto Mono"/>
+          <w:sz w:val="19"/>
+          <w:szCs w:val="19"/>
         </w:rPr>
         <w:t xml:space="preserve">def</w:t>
       </w:r>
@@ -578,9 +599,9 @@
       </w:r>
       <w:r>
         <w:rPr>
-          <w:rFonts w:ascii="Consolas" w:cs="Consolas" w:eastAsia="Consolas" w:hAnsi="Consolas"/>
-          <w:sz w:val="20"/>
-          <w:szCs w:val="20"/>
+          <w:rFonts w:ascii="Roboto Mono" w:cs="Roboto Mono" w:eastAsia="Roboto Mono" w:hAnsi="Roboto Mono"/>
+          <w:sz w:val="19"/>
+          <w:szCs w:val="19"/>
         </w:rPr>
         <w:t xml:space="preserve">both_leds(...)</w:t>
       </w:r>
@@ -605,9 +626,9 @@
       </w:r>
       <w:r>
         <w:rPr>
-          <w:rFonts w:ascii="Consolas" w:cs="Consolas" w:eastAsia="Consolas" w:hAnsi="Consolas"/>
-          <w:sz w:val="20"/>
-          <w:szCs w:val="20"/>
+          <w:rFonts w:ascii="Roboto Mono" w:cs="Roboto Mono" w:eastAsia="Roboto Mono" w:hAnsi="Roboto Mono"/>
+          <w:sz w:val="19"/>
+          <w:szCs w:val="19"/>
         </w:rPr>
         <w:t xml:space="preserve">r</w:t>
       </w:r>
@@ -620,9 +641,9 @@
       </w:r>
       <w:r>
         <w:rPr>
-          <w:rFonts w:ascii="Consolas" w:cs="Consolas" w:eastAsia="Consolas" w:hAnsi="Consolas"/>
-          <w:sz w:val="20"/>
-          <w:szCs w:val="20"/>
+          <w:rFonts w:ascii="Roboto Mono" w:cs="Roboto Mono" w:eastAsia="Roboto Mono" w:hAnsi="Roboto Mono"/>
+          <w:sz w:val="19"/>
+          <w:szCs w:val="19"/>
         </w:rPr>
         <w:t xml:space="preserve">g</w:t>
       </w:r>
@@ -635,9 +656,9 @@
       </w:r>
       <w:r>
         <w:rPr>
-          <w:rFonts w:ascii="Consolas" w:cs="Consolas" w:eastAsia="Consolas" w:hAnsi="Consolas"/>
-          <w:sz w:val="20"/>
-          <w:szCs w:val="20"/>
+          <w:rFonts w:ascii="Roboto Mono" w:cs="Roboto Mono" w:eastAsia="Roboto Mono" w:hAnsi="Roboto Mono"/>
+          <w:sz w:val="19"/>
+          <w:szCs w:val="19"/>
         </w:rPr>
         <w:t xml:space="preserve">b</w:t>
       </w:r>
@@ -650,9 +671,9 @@
       </w:r>
       <w:r>
         <w:rPr>
-          <w:rFonts w:ascii="Consolas" w:cs="Consolas" w:eastAsia="Consolas" w:hAnsi="Consolas"/>
-          <w:sz w:val="20"/>
-          <w:szCs w:val="20"/>
+          <w:rFonts w:ascii="Roboto Mono" w:cs="Roboto Mono" w:eastAsia="Roboto Mono" w:hAnsi="Roboto Mono"/>
+          <w:sz w:val="19"/>
+          <w:szCs w:val="19"/>
         </w:rPr>
         <w:t xml:space="preserve">both_leds(0, 1, 0)</w:t>
       </w:r>
@@ -665,9 +686,9 @@
       </w:r>
       <w:r>
         <w:rPr>
-          <w:rFonts w:ascii="Consolas" w:cs="Consolas" w:eastAsia="Consolas" w:hAnsi="Consolas"/>
-          <w:sz w:val="20"/>
-          <w:szCs w:val="20"/>
+          <w:rFonts w:ascii="Roboto Mono" w:cs="Roboto Mono" w:eastAsia="Roboto Mono" w:hAnsi="Roboto Mono"/>
+          <w:sz w:val="19"/>
+          <w:szCs w:val="19"/>
         </w:rPr>
         <w:t xml:space="preserve">r</w:t>
       </w:r>
@@ -680,9 +701,9 @@
       </w:r>
       <w:r>
         <w:rPr>
-          <w:rFonts w:ascii="Consolas" w:cs="Consolas" w:eastAsia="Consolas" w:hAnsi="Consolas"/>
-          <w:sz w:val="20"/>
-          <w:szCs w:val="20"/>
+          <w:rFonts w:ascii="Roboto Mono" w:cs="Roboto Mono" w:eastAsia="Roboto Mono" w:hAnsi="Roboto Mono"/>
+          <w:sz w:val="19"/>
+          <w:szCs w:val="19"/>
         </w:rPr>
         <w:t xml:space="preserve">g</w:t>
       </w:r>
@@ -695,9 +716,9 @@
       </w:r>
       <w:r>
         <w:rPr>
-          <w:rFonts w:ascii="Consolas" w:cs="Consolas" w:eastAsia="Consolas" w:hAnsi="Consolas"/>
-          <w:sz w:val="20"/>
-          <w:szCs w:val="20"/>
+          <w:rFonts w:ascii="Roboto Mono" w:cs="Roboto Mono" w:eastAsia="Roboto Mono" w:hAnsi="Roboto Mono"/>
+          <w:sz w:val="19"/>
+          <w:szCs w:val="19"/>
         </w:rPr>
         <w:t xml:space="preserve">b</w:t>
       </w:r>
@@ -722,9 +743,9 @@
       </w:r>
       <w:r>
         <w:rPr>
-          <w:rFonts w:ascii="Consolas" w:cs="Consolas" w:eastAsia="Consolas" w:hAnsi="Consolas"/>
-          <w:sz w:val="20"/>
-          <w:szCs w:val="20"/>
+          <w:rFonts w:ascii="Roboto Mono" w:cs="Roboto Mono" w:eastAsia="Roboto Mono" w:hAnsi="Roboto Mono"/>
+          <w:sz w:val="19"/>
+          <w:szCs w:val="19"/>
         </w:rPr>
         <w:t xml:space="preserve">both_leds(0, 1, 0)</w:t>
       </w:r>
@@ -896,7 +917,7 @@
             </w:pPr>
             <w:r>
               <w:rPr>
-                <w:rFonts w:ascii="Consolas" w:cs="Consolas" w:eastAsia="Consolas" w:hAnsi="Consolas"/>
+                <w:rFonts w:ascii="Roboto Mono" w:cs="Roboto Mono" w:eastAsia="Roboto Mono" w:hAnsi="Roboto Mono"/>
                 <w:sz w:val="19"/>
                 <w:szCs w:val="19"/>
               </w:rPr>
@@ -909,7 +930,7 @@
             </w:pPr>
             <w:r>
               <w:rPr>
-                <w:rFonts w:ascii="Consolas" w:cs="Consolas" w:eastAsia="Consolas" w:hAnsi="Consolas"/>
+                <w:rFonts w:ascii="Roboto Mono" w:cs="Roboto Mono" w:eastAsia="Roboto Mono" w:hAnsi="Roboto Mono"/>
                 <w:sz w:val="19"/>
                 <w:szCs w:val="19"/>
               </w:rPr>
@@ -922,7 +943,7 @@
             </w:pPr>
             <w:r>
               <w:rPr>
-                <w:rFonts w:ascii="Consolas" w:cs="Consolas" w:eastAsia="Consolas" w:hAnsi="Consolas"/>
+                <w:rFonts w:ascii="Roboto Mono" w:cs="Roboto Mono" w:eastAsia="Roboto Mono" w:hAnsi="Roboto Mono"/>
                 <w:sz w:val="19"/>
                 <w:szCs w:val="19"/>
               </w:rPr>
@@ -935,7 +956,7 @@
             </w:pPr>
             <w:r>
               <w:rPr>
-                <w:rFonts w:ascii="Consolas" w:cs="Consolas" w:eastAsia="Consolas" w:hAnsi="Consolas"/>
+                <w:rFonts w:ascii="Roboto Mono" w:cs="Roboto Mono" w:eastAsia="Roboto Mono" w:hAnsi="Roboto Mono"/>
                 <w:sz w:val="19"/>
                 <w:szCs w:val="19"/>
               </w:rPr>
@@ -948,7 +969,7 @@
             </w:pPr>
             <w:r>
               <w:rPr>
-                <w:rFonts w:ascii="Consolas" w:cs="Consolas" w:eastAsia="Consolas" w:hAnsi="Consolas"/>
+                <w:rFonts w:ascii="Roboto Mono" w:cs="Roboto Mono" w:eastAsia="Roboto Mono" w:hAnsi="Roboto Mono"/>
                 <w:sz w:val="19"/>
                 <w:szCs w:val="19"/>
               </w:rPr>
@@ -960,8 +981,15 @@
     </w:tbl>
     <w:p>
       <w:pPr>
-        <w:spacing w:after="140"/>
-      </w:pPr>
+        <w:spacing w:after="60" w:line="120"/>
+      </w:pPr>
+      <w:r>
+        <w:rPr>
+          <w:sz w:val="8"/>
+          <w:szCs w:val="8"/>
+        </w:rPr>
+        <w:t xml:space="preserve"/>
+      </w:r>
     </w:p>
     <w:p>
       <w:pPr>
@@ -1038,7 +1066,7 @@
             </w:pPr>
             <w:r>
               <w:rPr>
-                <w:rFonts w:ascii="Consolas" w:cs="Consolas" w:eastAsia="Consolas" w:hAnsi="Consolas"/>
+                <w:rFonts w:ascii="Roboto Mono" w:cs="Roboto Mono" w:eastAsia="Roboto Mono" w:hAnsi="Roboto Mono"/>
                 <w:sz w:val="19"/>
                 <w:szCs w:val="19"/>
               </w:rPr>
@@ -1051,7 +1079,7 @@
             </w:pPr>
             <w:r>
               <w:rPr>
-                <w:rFonts w:ascii="Consolas" w:cs="Consolas" w:eastAsia="Consolas" w:hAnsi="Consolas"/>
+                <w:rFonts w:ascii="Roboto Mono" w:cs="Roboto Mono" w:eastAsia="Roboto Mono" w:hAnsi="Roboto Mono"/>
                 <w:sz w:val="19"/>
                 <w:szCs w:val="19"/>
               </w:rPr>
@@ -1064,7 +1092,7 @@
             </w:pPr>
             <w:r>
               <w:rPr>
-                <w:rFonts w:ascii="Consolas" w:cs="Consolas" w:eastAsia="Consolas" w:hAnsi="Consolas"/>
+                <w:rFonts w:ascii="Roboto Mono" w:cs="Roboto Mono" w:eastAsia="Roboto Mono" w:hAnsi="Roboto Mono"/>
                 <w:sz w:val="19"/>
                 <w:szCs w:val="19"/>
               </w:rPr>
@@ -1077,7 +1105,7 @@
             </w:pPr>
             <w:r>
               <w:rPr>
-                <w:rFonts w:ascii="Consolas" w:cs="Consolas" w:eastAsia="Consolas" w:hAnsi="Consolas"/>
+                <w:rFonts w:ascii="Roboto Mono" w:cs="Roboto Mono" w:eastAsia="Roboto Mono" w:hAnsi="Roboto Mono"/>
                 <w:sz w:val="19"/>
                 <w:szCs w:val="19"/>
               </w:rPr>
@@ -1090,7 +1118,7 @@
             </w:pPr>
             <w:r>
               <w:rPr>
-                <w:rFonts w:ascii="Consolas" w:cs="Consolas" w:eastAsia="Consolas" w:hAnsi="Consolas"/>
+                <w:rFonts w:ascii="Roboto Mono" w:cs="Roboto Mono" w:eastAsia="Roboto Mono" w:hAnsi="Roboto Mono"/>
                 <w:sz w:val="19"/>
                 <w:szCs w:val="19"/>
               </w:rPr>
@@ -1103,7 +1131,7 @@
             </w:pPr>
             <w:r>
               <w:rPr>
-                <w:rFonts w:ascii="Consolas" w:cs="Consolas" w:eastAsia="Consolas" w:hAnsi="Consolas"/>
+                <w:rFonts w:ascii="Roboto Mono" w:cs="Roboto Mono" w:eastAsia="Roboto Mono" w:hAnsi="Roboto Mono"/>
                 <w:sz w:val="19"/>
                 <w:szCs w:val="19"/>
               </w:rPr>
@@ -1115,8 +1143,15 @@
     </w:tbl>
     <w:p>
       <w:pPr>
-        <w:spacing w:after="140"/>
-      </w:pPr>
+        <w:spacing w:after="60" w:line="120"/>
+      </w:pPr>
+      <w:r>
+        <w:rPr>
+          <w:sz w:val="8"/>
+          <w:szCs w:val="8"/>
+        </w:rPr>
+        <w:t xml:space="preserve"/>
+      </w:r>
     </w:p>
     <w:p>
       <w:pPr>
@@ -1171,7 +1206,7 @@
             </w:pPr>
             <w:r>
               <w:rPr>
-                <w:rFonts w:ascii="Consolas" w:cs="Consolas" w:eastAsia="Consolas" w:hAnsi="Consolas"/>
+                <w:rFonts w:ascii="Roboto Mono" w:cs="Roboto Mono" w:eastAsia="Roboto Mono" w:hAnsi="Roboto Mono"/>
                 <w:sz w:val="19"/>
                 <w:szCs w:val="19"/>
               </w:rPr>
@@ -1183,8 +1218,15 @@
     </w:tbl>
     <w:p>
       <w:pPr>
-        <w:spacing w:after="140"/>
-      </w:pPr>
+        <w:spacing w:after="60" w:line="120"/>
+      </w:pPr>
+      <w:r>
+        <w:rPr>
+          <w:sz w:val="8"/>
+          <w:szCs w:val="8"/>
+        </w:rPr>
+        <w:t xml:space="preserve"/>
+      </w:r>
     </w:p>
     <w:p>
       <w:pPr>
@@ -1211,9 +1253,9 @@
       </w:r>
       <w:r>
         <w:rPr>
-          <w:rFonts w:ascii="Consolas" w:cs="Consolas" w:eastAsia="Consolas" w:hAnsi="Consolas"/>
-          <w:sz w:val="20"/>
-          <w:szCs w:val="20"/>
+          <w:rFonts w:ascii="Roboto Mono" w:cs="Roboto Mono" w:eastAsia="Roboto Mono" w:hAnsi="Roboto Mono"/>
+          <w:sz w:val="19"/>
+          <w:szCs w:val="19"/>
         </w:rPr>
         <w:t xml:space="preserve">set_color</w:t>
       </w:r>
@@ -1226,9 +1268,9 @@
       </w:r>
       <w:r>
         <w:rPr>
-          <w:rFonts w:ascii="Consolas" w:cs="Consolas" w:eastAsia="Consolas" w:hAnsi="Consolas"/>
-          <w:sz w:val="20"/>
-          <w:szCs w:val="20"/>
+          <w:rFonts w:ascii="Roboto Mono" w:cs="Roboto Mono" w:eastAsia="Roboto Mono" w:hAnsi="Roboto Mono"/>
+          <w:sz w:val="19"/>
+          <w:szCs w:val="19"/>
         </w:rPr>
         <w:t xml:space="preserve">both_leds</w:t>
       </w:r>
@@ -1241,9 +1283,9 @@
       </w:r>
       <w:r>
         <w:rPr>
-          <w:rFonts w:ascii="Consolas" w:cs="Consolas" w:eastAsia="Consolas" w:hAnsi="Consolas"/>
-          <w:sz w:val="20"/>
-          <w:szCs w:val="20"/>
+          <w:rFonts w:ascii="Roboto Mono" w:cs="Roboto Mono" w:eastAsia="Roboto Mono" w:hAnsi="Roboto Mono"/>
+          <w:sz w:val="19"/>
+          <w:szCs w:val="19"/>
         </w:rPr>
         <w:t xml:space="preserve">set_color</w:t>
       </w:r>
@@ -1256,9 +1298,9 @@
       </w:r>
       <w:r>
         <w:rPr>
-          <w:rFonts w:ascii="Consolas" w:cs="Consolas" w:eastAsia="Consolas" w:hAnsi="Consolas"/>
-          <w:sz w:val="20"/>
-          <w:szCs w:val="20"/>
+          <w:rFonts w:ascii="Roboto Mono" w:cs="Roboto Mono" w:eastAsia="Roboto Mono" w:hAnsi="Roboto Mono"/>
+          <w:sz w:val="19"/>
+          <w:szCs w:val="19"/>
         </w:rPr>
         <w:t xml:space="preserve">blink</w:t>
       </w:r>
@@ -1271,9 +1313,9 @@
       </w:r>
       <w:r>
         <w:rPr>
-          <w:rFonts w:ascii="Consolas" w:cs="Consolas" w:eastAsia="Consolas" w:hAnsi="Consolas"/>
-          <w:sz w:val="20"/>
-          <w:szCs w:val="20"/>
+          <w:rFonts w:ascii="Roboto Mono" w:cs="Roboto Mono" w:eastAsia="Roboto Mono" w:hAnsi="Roboto Mono"/>
+          <w:sz w:val="19"/>
+          <w:szCs w:val="19"/>
         </w:rPr>
         <w:t xml:space="preserve">both_leds</w:t>
       </w:r>
@@ -1308,9 +1350,9 @@
       </w:r>
       <w:r>
         <w:rPr>
-          <w:rFonts w:ascii="Consolas" w:cs="Consolas" w:eastAsia="Consolas" w:hAnsi="Consolas"/>
-          <w:sz w:val="20"/>
-          <w:szCs w:val="20"/>
+          <w:rFonts w:ascii="Roboto Mono" w:cs="Roboto Mono" w:eastAsia="Roboto Mono" w:hAnsi="Roboto Mono"/>
+          <w:sz w:val="19"/>
+          <w:szCs w:val="19"/>
         </w:rPr>
         <w:t xml:space="preserve">blink(3, 0.5, 0.5, 1, 0, 0)</w:t>
       </w:r>
@@ -1375,7 +1417,7 @@
             </w:pPr>
             <w:r>
               <w:rPr>
-                <w:rFonts w:ascii="Consolas" w:cs="Consolas" w:eastAsia="Consolas" w:hAnsi="Consolas"/>
+                <w:rFonts w:ascii="Roboto Mono" w:cs="Roboto Mono" w:eastAsia="Roboto Mono" w:hAnsi="Roboto Mono"/>
                 <w:sz w:val="19"/>
                 <w:szCs w:val="19"/>
               </w:rPr>
@@ -1388,7 +1430,7 @@
             </w:pPr>
             <w:r>
               <w:rPr>
-                <w:rFonts w:ascii="Consolas" w:cs="Consolas" w:eastAsia="Consolas" w:hAnsi="Consolas"/>
+                <w:rFonts w:ascii="Roboto Mono" w:cs="Roboto Mono" w:eastAsia="Roboto Mono" w:hAnsi="Roboto Mono"/>
                 <w:sz w:val="19"/>
                 <w:szCs w:val="19"/>
               </w:rPr>
@@ -1401,7 +1443,7 @@
             </w:pPr>
             <w:r>
               <w:rPr>
-                <w:rFonts w:ascii="Consolas" w:cs="Consolas" w:eastAsia="Consolas" w:hAnsi="Consolas"/>
+                <w:rFonts w:ascii="Roboto Mono" w:cs="Roboto Mono" w:eastAsia="Roboto Mono" w:hAnsi="Roboto Mono"/>
                 <w:sz w:val="19"/>
                 <w:szCs w:val="19"/>
               </w:rPr>
@@ -1414,7 +1456,7 @@
             </w:pPr>
             <w:r>
               <w:rPr>
-                <w:rFonts w:ascii="Consolas" w:cs="Consolas" w:eastAsia="Consolas" w:hAnsi="Consolas"/>
+                <w:rFonts w:ascii="Roboto Mono" w:cs="Roboto Mono" w:eastAsia="Roboto Mono" w:hAnsi="Roboto Mono"/>
                 <w:sz w:val="19"/>
                 <w:szCs w:val="19"/>
               </w:rPr>
@@ -1427,7 +1469,7 @@
             </w:pPr>
             <w:r>
               <w:rPr>
-                <w:rFonts w:ascii="Consolas" w:cs="Consolas" w:eastAsia="Consolas" w:hAnsi="Consolas"/>
+                <w:rFonts w:ascii="Roboto Mono" w:cs="Roboto Mono" w:eastAsia="Roboto Mono" w:hAnsi="Roboto Mono"/>
                 <w:sz w:val="19"/>
                 <w:szCs w:val="19"/>
               </w:rPr>
@@ -1440,7 +1482,7 @@
             </w:pPr>
             <w:r>
               <w:rPr>
-                <w:rFonts w:ascii="Consolas" w:cs="Consolas" w:eastAsia="Consolas" w:hAnsi="Consolas"/>
+                <w:rFonts w:ascii="Roboto Mono" w:cs="Roboto Mono" w:eastAsia="Roboto Mono" w:hAnsi="Roboto Mono"/>
                 <w:sz w:val="19"/>
                 <w:szCs w:val="19"/>
               </w:rPr>
@@ -1453,7 +1495,7 @@
             </w:pPr>
             <w:r>
               <w:rPr>
-                <w:rFonts w:ascii="Consolas" w:cs="Consolas" w:eastAsia="Consolas" w:hAnsi="Consolas"/>
+                <w:rFonts w:ascii="Roboto Mono" w:cs="Roboto Mono" w:eastAsia="Roboto Mono" w:hAnsi="Roboto Mono"/>
                 <w:sz w:val="19"/>
                 <w:szCs w:val="19"/>
               </w:rPr>
@@ -1465,8 +1507,15 @@
     </w:tbl>
     <w:p>
       <w:pPr>
-        <w:spacing w:after="140"/>
-      </w:pPr>
+        <w:spacing w:after="60" w:line="120"/>
+      </w:pPr>
+      <w:r>
+        <w:rPr>
+          <w:sz w:val="8"/>
+          <w:szCs w:val="8"/>
+        </w:rPr>
+        <w:t xml:space="preserve"/>
+      </w:r>
     </w:p>
     <w:p>
       <w:pPr>
@@ -1481,9 +1530,9 @@
       </w:r>
       <w:r>
         <w:rPr>
-          <w:rFonts w:ascii="Consolas" w:cs="Consolas" w:eastAsia="Consolas" w:hAnsi="Consolas"/>
-          <w:sz w:val="20"/>
-          <w:szCs w:val="20"/>
+          <w:rFonts w:ascii="Roboto Mono" w:cs="Roboto Mono" w:eastAsia="Roboto Mono" w:hAnsi="Roboto Mono"/>
+          <w:sz w:val="19"/>
+          <w:szCs w:val="19"/>
         </w:rPr>
         <w:t xml:space="preserve">r = 0</w:t>
       </w:r>
@@ -1496,9 +1545,9 @@
       </w:r>
       <w:r>
         <w:rPr>
-          <w:rFonts w:ascii="Consolas" w:cs="Consolas" w:eastAsia="Consolas" w:hAnsi="Consolas"/>
-          <w:sz w:val="20"/>
-          <w:szCs w:val="20"/>
+          <w:rFonts w:ascii="Roboto Mono" w:cs="Roboto Mono" w:eastAsia="Roboto Mono" w:hAnsi="Roboto Mono"/>
+          <w:sz w:val="19"/>
+          <w:szCs w:val="19"/>
         </w:rPr>
         <w:t xml:space="preserve">b = 1</w:t>
       </w:r>
@@ -1511,9 +1560,9 @@
       </w:r>
       <w:r>
         <w:rPr>
-          <w:rFonts w:ascii="Consolas" w:cs="Consolas" w:eastAsia="Consolas" w:hAnsi="Consolas"/>
-          <w:sz w:val="20"/>
-          <w:szCs w:val="20"/>
+          <w:rFonts w:ascii="Roboto Mono" w:cs="Roboto Mono" w:eastAsia="Roboto Mono" w:hAnsi="Roboto Mono"/>
+          <w:sz w:val="19"/>
+          <w:szCs w:val="19"/>
         </w:rPr>
         <w:t xml:space="preserve">blink(...)</w:t>
       </w:r>
@@ -1600,7 +1649,7 @@
             </w:pPr>
             <w:r>
               <w:rPr>
-                <w:rFonts w:ascii="Consolas" w:cs="Consolas" w:eastAsia="Consolas" w:hAnsi="Consolas"/>
+                <w:rFonts w:ascii="Roboto Mono" w:cs="Roboto Mono" w:eastAsia="Roboto Mono" w:hAnsi="Roboto Mono"/>
                 <w:sz w:val="19"/>
                 <w:szCs w:val="19"/>
               </w:rPr>
@@ -1612,8 +1661,15 @@
     </w:tbl>
     <w:p>
       <w:pPr>
-        <w:spacing w:after="140"/>
-      </w:pPr>
+        <w:spacing w:after="60" w:line="120"/>
+      </w:pPr>
+      <w:r>
+        <w:rPr>
+          <w:sz w:val="8"/>
+          <w:szCs w:val="8"/>
+        </w:rPr>
+        <w:t xml:space="preserve"/>
+      </w:r>
     </w:p>
     <w:p>
       <w:pPr>
@@ -1699,9 +1755,9 @@
       </w:r>
       <w:r>
         <w:rPr>
-          <w:rFonts w:ascii="Consolas" w:cs="Consolas" w:eastAsia="Consolas" w:hAnsi="Consolas"/>
-          <w:sz w:val="20"/>
-          <w:szCs w:val="20"/>
+          <w:rFonts w:ascii="Roboto Mono" w:cs="Roboto Mono" w:eastAsia="Roboto Mono" w:hAnsi="Roboto Mono"/>
+          <w:sz w:val="19"/>
+          <w:szCs w:val="19"/>
         </w:rPr>
         <w:t xml:space="preserve">p02_flashing_lights.py</w:t>
       </w:r>
@@ -1741,9 +1797,9 @@
       </w:r>
       <w:r>
         <w:rPr>
-          <w:rFonts w:ascii="Consolas" w:cs="Consolas" w:eastAsia="Consolas" w:hAnsi="Consolas"/>
-          <w:sz w:val="20"/>
-          <w:szCs w:val="20"/>
+          <w:rFonts w:ascii="Roboto Mono" w:cs="Roboto Mono" w:eastAsia="Roboto Mono" w:hAnsi="Roboto Mono"/>
+          <w:sz w:val="19"/>
+          <w:szCs w:val="19"/>
         </w:rPr>
         <w:t xml:space="preserve"># WORK</w:t>
       </w:r>
@@ -1756,9 +1812,9 @@
       </w:r>
       <w:r>
         <w:rPr>
-          <w:rFonts w:ascii="Consolas" w:cs="Consolas" w:eastAsia="Consolas" w:hAnsi="Consolas"/>
-          <w:sz w:val="20"/>
-          <w:szCs w:val="20"/>
+          <w:rFonts w:ascii="Roboto Mono" w:cs="Roboto Mono" w:eastAsia="Roboto Mono" w:hAnsi="Roboto Mono"/>
+          <w:sz w:val="19"/>
+          <w:szCs w:val="19"/>
         </w:rPr>
         <w:t xml:space="preserve">while</w:t>
       </w:r>
@@ -1783,9 +1839,9 @@
       </w:r>
       <w:r>
         <w:rPr>
-          <w:rFonts w:ascii="Consolas" w:cs="Consolas" w:eastAsia="Consolas" w:hAnsi="Consolas"/>
-          <w:sz w:val="20"/>
-          <w:szCs w:val="20"/>
+          <w:rFonts w:ascii="Roboto Mono" w:cs="Roboto Mono" w:eastAsia="Roboto Mono" w:hAnsi="Roboto Mono"/>
+          <w:sz w:val="19"/>
+          <w:szCs w:val="19"/>
         </w:rPr>
         <w:t xml:space="preserve">for</w:t>
       </w:r>
@@ -1850,7 +1906,7 @@
             </w:pPr>
             <w:r>
               <w:rPr>
-                <w:rFonts w:ascii="Consolas" w:cs="Consolas" w:eastAsia="Consolas" w:hAnsi="Consolas"/>
+                <w:rFonts w:ascii="Roboto Mono" w:cs="Roboto Mono" w:eastAsia="Roboto Mono" w:hAnsi="Roboto Mono"/>
                 <w:sz w:val="19"/>
                 <w:szCs w:val="19"/>
               </w:rPr>
@@ -1863,7 +1919,7 @@
             </w:pPr>
             <w:r>
               <w:rPr>
-                <w:rFonts w:ascii="Consolas" w:cs="Consolas" w:eastAsia="Consolas" w:hAnsi="Consolas"/>
+                <w:rFonts w:ascii="Roboto Mono" w:cs="Roboto Mono" w:eastAsia="Roboto Mono" w:hAnsi="Roboto Mono"/>
                 <w:sz w:val="19"/>
                 <w:szCs w:val="19"/>
               </w:rPr>
@@ -1876,7 +1932,7 @@
             </w:pPr>
             <w:r>
               <w:rPr>
-                <w:rFonts w:ascii="Consolas" w:cs="Consolas" w:eastAsia="Consolas" w:hAnsi="Consolas"/>
+                <w:rFonts w:ascii="Roboto Mono" w:cs="Roboto Mono" w:eastAsia="Roboto Mono" w:hAnsi="Roboto Mono"/>
                 <w:sz w:val="19"/>
                 <w:szCs w:val="19"/>
               </w:rPr>
@@ -1889,7 +1945,7 @@
             </w:pPr>
             <w:r>
               <w:rPr>
-                <w:rFonts w:ascii="Consolas" w:cs="Consolas" w:eastAsia="Consolas" w:hAnsi="Consolas"/>
+                <w:rFonts w:ascii="Roboto Mono" w:cs="Roboto Mono" w:eastAsia="Roboto Mono" w:hAnsi="Roboto Mono"/>
                 <w:sz w:val="19"/>
                 <w:szCs w:val="19"/>
               </w:rPr>
@@ -1902,7 +1958,7 @@
             </w:pPr>
             <w:r>
               <w:rPr>
-                <w:rFonts w:ascii="Consolas" w:cs="Consolas" w:eastAsia="Consolas" w:hAnsi="Consolas"/>
+                <w:rFonts w:ascii="Roboto Mono" w:cs="Roboto Mono" w:eastAsia="Roboto Mono" w:hAnsi="Roboto Mono"/>
                 <w:sz w:val="19"/>
                 <w:szCs w:val="19"/>
               </w:rPr>
@@ -1914,8 +1970,15 @@
     </w:tbl>
     <w:p>
       <w:pPr>
-        <w:spacing w:after="140"/>
-      </w:pPr>
+        <w:spacing w:after="60" w:line="120"/>
+      </w:pPr>
+      <w:r>
+        <w:rPr>
+          <w:sz w:val="8"/>
+          <w:szCs w:val="8"/>
+        </w:rPr>
+        <w:t xml:space="preserve"/>
+      </w:r>
     </w:p>
     <w:p>
       <w:pPr>
@@ -1970,7 +2033,7 @@
             </w:pPr>
             <w:r>
               <w:rPr>
-                <w:rFonts w:ascii="Consolas" w:cs="Consolas" w:eastAsia="Consolas" w:hAnsi="Consolas"/>
+                <w:rFonts w:ascii="Roboto Mono" w:cs="Roboto Mono" w:eastAsia="Roboto Mono" w:hAnsi="Roboto Mono"/>
                 <w:sz w:val="19"/>
                 <w:szCs w:val="19"/>
               </w:rPr>
@@ -1982,8 +2045,15 @@
     </w:tbl>
     <w:p>
       <w:pPr>
-        <w:spacing w:after="140"/>
-      </w:pPr>
+        <w:spacing w:after="60" w:line="120"/>
+      </w:pPr>
+      <w:r>
+        <w:rPr>
+          <w:sz w:val="8"/>
+          <w:szCs w:val="8"/>
+        </w:rPr>
+        <w:t xml:space="preserve"/>
+      </w:r>
     </w:p>
     <w:p>
       <w:pPr>
@@ -1998,9 +2068,9 @@
       </w:r>
       <w:r>
         <w:rPr>
-          <w:rFonts w:ascii="Consolas" w:cs="Consolas" w:eastAsia="Consolas" w:hAnsi="Consolas"/>
-          <w:sz w:val="20"/>
-          <w:szCs w:val="20"/>
+          <w:rFonts w:ascii="Roboto Mono" w:cs="Roboto Mono" w:eastAsia="Roboto Mono" w:hAnsi="Roboto Mono"/>
+          <w:sz w:val="19"/>
+          <w:szCs w:val="19"/>
         </w:rPr>
         <w:t xml:space="preserve">blink</w:t>
       </w:r>
@@ -2059,9 +2129,9 @@
       </w:r>
       <w:r>
         <w:rPr>
-          <w:rFonts w:ascii="Consolas" w:cs="Consolas" w:eastAsia="Consolas" w:hAnsi="Consolas"/>
-          <w:sz w:val="20"/>
-          <w:szCs w:val="20"/>
+          <w:rFonts w:ascii="Roboto Mono" w:cs="Roboto Mono" w:eastAsia="Roboto Mono" w:hAnsi="Roboto Mono"/>
+          <w:sz w:val="19"/>
+          <w:szCs w:val="19"/>
         </w:rPr>
         <w:t xml:space="preserve"># WORK</w:t>
       </w:r>
@@ -2074,9 +2144,9 @@
       </w:r>
       <w:r>
         <w:rPr>
-          <w:rFonts w:ascii="Consolas" w:cs="Consolas" w:eastAsia="Consolas" w:hAnsi="Consolas"/>
-          <w:sz w:val="20"/>
-          <w:szCs w:val="20"/>
+          <w:rFonts w:ascii="Roboto Mono" w:cs="Roboto Mono" w:eastAsia="Roboto Mono" w:hAnsi="Roboto Mono"/>
+          <w:sz w:val="19"/>
+          <w:szCs w:val="19"/>
         </w:rPr>
         <w:t xml:space="preserve"># FLEX</w:t>
       </w:r>
@@ -2101,9 +2171,9 @@
       </w:r>
       <w:r>
         <w:rPr>
-          <w:rFonts w:ascii="Consolas" w:cs="Consolas" w:eastAsia="Consolas" w:hAnsi="Consolas"/>
-          <w:sz w:val="20"/>
-          <w:szCs w:val="20"/>
+          <w:rFonts w:ascii="Roboto Mono" w:cs="Roboto Mono" w:eastAsia="Roboto Mono" w:hAnsi="Roboto Mono"/>
+          <w:sz w:val="19"/>
+          <w:szCs w:val="19"/>
         </w:rPr>
         <w:t xml:space="preserve">blink</w:t>
       </w:r>
@@ -2162,9 +2232,9 @@
       </w:r>
       <w:r>
         <w:rPr>
-          <w:rFonts w:ascii="Consolas" w:cs="Consolas" w:eastAsia="Consolas" w:hAnsi="Consolas"/>
-          <w:sz w:val="20"/>
-          <w:szCs w:val="20"/>
+          <w:rFonts w:ascii="Roboto Mono" w:cs="Roboto Mono" w:eastAsia="Roboto Mono" w:hAnsi="Roboto Mono"/>
+          <w:sz w:val="19"/>
+          <w:szCs w:val="19"/>
         </w:rPr>
         <w:t xml:space="preserve">blink</w:t>
       </w:r>
@@ -2177,9 +2247,9 @@
       </w:r>
       <w:r>
         <w:rPr>
-          <w:rFonts w:ascii="Consolas" w:cs="Consolas" w:eastAsia="Consolas" w:hAnsi="Consolas"/>
-          <w:sz w:val="20"/>
-          <w:szCs w:val="20"/>
+          <w:rFonts w:ascii="Roboto Mono" w:cs="Roboto Mono" w:eastAsia="Roboto Mono" w:hAnsi="Roboto Mono"/>
+          <w:sz w:val="19"/>
+          <w:szCs w:val="19"/>
         </w:rPr>
         <w:t xml:space="preserve">on_time</w:t>
       </w:r>
@@ -2192,9 +2262,9 @@
       </w:r>
       <w:r>
         <w:rPr>
-          <w:rFonts w:ascii="Consolas" w:cs="Consolas" w:eastAsia="Consolas" w:hAnsi="Consolas"/>
-          <w:sz w:val="20"/>
-          <w:szCs w:val="20"/>
+          <w:rFonts w:ascii="Roboto Mono" w:cs="Roboto Mono" w:eastAsia="Roboto Mono" w:hAnsi="Roboto Mono"/>
+          <w:sz w:val="19"/>
+          <w:szCs w:val="19"/>
         </w:rPr>
         <w:t xml:space="preserve">on_time</w:t>
       </w:r>
@@ -2207,9 +2277,9 @@
       </w:r>
       <w:r>
         <w:rPr>
-          <w:rFonts w:ascii="Consolas" w:cs="Consolas" w:eastAsia="Consolas" w:hAnsi="Consolas"/>
-          <w:sz w:val="20"/>
-          <w:szCs w:val="20"/>
+          <w:rFonts w:ascii="Roboto Mono" w:cs="Roboto Mono" w:eastAsia="Roboto Mono" w:hAnsi="Roboto Mono"/>
+          <w:sz w:val="19"/>
+          <w:szCs w:val="19"/>
         </w:rPr>
         <w:t xml:space="preserve">while</w:t>
       </w:r>
@@ -2233,7 +2303,7 @@
           <w:sz w:val="18"/>
           <w:szCs w:val="18"/>
         </w:rPr>
-        <w:t xml:space="preserve">V03</w:t>
+        <w:t xml:space="preserve">V05</w:t>
       </w:r>
     </w:p>
     <w:p>
@@ -2351,7 +2421,7 @@
               <w:sz w:val="17"/>
               <w:szCs w:val="17"/>
             </w:rPr>
-            <w:t xml:space="preserve">Project 02: Flashing Lights  ·  V03</w:t>
+            <w:t xml:space="preserve">Project 02: Flashing Lights  ·  V05</w:t>
           </w:r>
         </w:p>
       </w:tc>

</xml_diff>

<commit_message>
fixed initialize and get_closest_distance
</commit_message>
<xml_diff>
--- a/guide_builder/P02_Flashing_Lights_Guide.docx
+++ b/guide_builder/P02_Flashing_Lights_Guide.docx
@@ -1929,7 +1929,7 @@
           <w:sz w:val="22"/>
           <w:szCs w:val="22"/>
         </w:rPr>
-        <w:t xml:space="preserve"> over and over to do that. Each one wraps up the one below it so you can say more with less typing. In P04 you write your own.</w:t>
+        <w:t xml:space="preserve"> over and over to do that. Each one wraps up the one below it so you can say more with less typing. Before long you will be writing your own.</w:t>
       </w:r>
     </w:p>
     <w:p>
@@ -3244,7 +3244,7 @@
               <w:sz w:val="17"/>
               <w:szCs w:val="17"/>
             </w:rPr>
-            <w:t xml:space="preserve">Project 02: Flashing Lights  ·  V14</w:t>
+            <w:t xml:space="preserve">Project 02: Flashing Lights  ·  V15</w:t>
           </w:r>
         </w:p>
       </w:tc>

</xml_diff>